<commit_message>
Alinha o procedimento Python à nomenclatura de mídia da fábrica (CD1-DAD/CD2-DSF/CD3-DSE)
Renomeia as referências a "mídia (DVD/CD)" no procedimento de
instalação do software Python para o padrão de identificação usado
na fábrica: CD(1) DAD (Ambiente de Desenvolvimento — instalador do
Python + pacotes offline), CD(2) DSF (Código Fonte — pasta
python-app) e CD(3) DSE (Executável — dist\Inclinometro2Eixos\ ou o
instalador Setup.exe). A tabela de equipamentos e as seções 3/4.1-4.4
agora citam cada CD pelo nome; docs/README.md reflete a mesma
nomenclatura no resumo.

Co-Authored-By: Claude Sonnet 5 <noreply@anthropic.com>
Claude-Session: https://claude.ai/code/session_01VvvtJDPvh4mDoSVpkHza1d
</commit_message>
<xml_diff>
--- a/docs/procedimento-instalacao-software-python.docx
+++ b/docs/procedimento-instalacao-software-python.docx
@@ -379,7 +379,7 @@
           <w:sz w:val="21"/>
           <w:szCs w:val="21"/>
         </w:rPr>
-        <w:t xml:space="preserve">IMPORTANTE: a instalação em campo/fábrica é sempre realizada em computador com Windows (10 ou 11) e sem conexão à internet — a partir de mídia (DVD/CD) previamente gravada e arquivada no repositório físico da fábrica. Este procedimento reflete esse cenário como o caminho normal de uso; a preparação da mídia (que exige internet, mas é feita à parte, por quem mantém o software) é descrita separadamente na seção 4.1.</w:t>
+        <w:t xml:space="preserve">IMPORTANTE: a instalação em campo/fábrica é sempre realizada em computador com Windows (10 ou 11) e sem conexão à internet — a partir de mídia previamente gravada e arquivada no repositório físico da fábrica, no padrão de identificação da empresa: CD(1) DAD (Ambiente de Desenvolvimento), CD(2) DSF (Código Fonte) e CD(3) DSE (Executável). Este procedimento reflete esse cenário como o caminho normal de uso; a preparação de cada mídia (que exige internet, mas é feita à parte, por quem mantém o software) é descrita separadamente na seção 4.1.</w:t>
       </w:r>
     </w:p>
     <w:p>
@@ -814,7 +814,7 @@
                 <w:sz w:val="21"/>
                 <w:szCs w:val="21"/>
               </w:rPr>
-              <w:t xml:space="preserve">Mídia (DVD ou CD) de instalação, arquivada no repositório físico da fábrica, contendo a pasta python-app completa (código-fonte + pacote offline_packages, ou o executável/instalador já compilado)</w:t>
+              <w:t xml:space="preserve">CD(1) DAD — Ambiente de Desenvolvimento: instalador do Python 3.10+ e o pacote offline_packages (dependências pré-baixadas); necessário apenas na instalação a partir do código-fonte (seção 4.2)</w:t>
             </w:r>
           </w:p>
         </w:tc>
@@ -886,7 +886,7 @@
                 <w:sz w:val="21"/>
                 <w:szCs w:val="21"/>
               </w:rPr>
-              <w:t xml:space="preserve">—</w:t>
+              <w:t xml:space="preserve">DAD</w:t>
             </w:r>
           </w:p>
         </w:tc>
@@ -960,7 +960,7 @@
                 <w:sz w:val="21"/>
                 <w:szCs w:val="21"/>
               </w:rPr>
-              <w:t xml:space="preserve">Python 3.10 ou superior, instalado com "Add python.exe to PATH" marcado (apenas se a mídia trouxer o código-fonte — ver 4.2)</w:t>
+              <w:t xml:space="preserve">CD(2) DSF — Código Fonte: pasta python-app completa; necessário apenas na instalação a partir do código-fonte (seção 4.2)</w:t>
             </w:r>
           </w:p>
         </w:tc>
@@ -1032,7 +1032,153 @@
                 <w:sz w:val="21"/>
                 <w:szCs w:val="21"/>
               </w:rPr>
-              <w:t xml:space="preserve">—</w:t>
+              <w:t xml:space="preserve">DSF</w:t>
+            </w:r>
+          </w:p>
+        </w:tc>
+      </w:tr>
+      <w:tr>
+        <w:tc>
+          <w:tcPr>
+            <w:tcW w:type="dxa" w:w="700"/>
+            <w:tcBorders>
+              <w:top w:val="single" w:color="000000" w:sz="4"/>
+              <w:left w:val="single" w:color="000000" w:sz="4"/>
+              <w:bottom w:val="single" w:color="000000" w:sz="4"/>
+              <w:right w:val="single" w:color="000000" w:sz="4"/>
+            </w:tcBorders>
+            <w:tcMar>
+              <w:top w:type="dxa" w:w="60"/>
+              <w:left w:type="dxa" w:w="100"/>
+              <w:bottom w:type="dxa" w:w="60"/>
+              <w:right w:type="dxa" w:w="100"/>
+            </w:tcMar>
+            <w:vAlign w:val="center"/>
+          </w:tcPr>
+          <w:p>
+            <w:pPr>
+              <w:spacing w:line="240" w:lineRule="auto"/>
+              <w:jc w:val="left"/>
+            </w:pPr>
+            <w:r>
+              <w:rPr>
+                <w:rFonts w:ascii="Arial" w:cs="Arial" w:eastAsia="Arial" w:hAnsi="Arial"/>
+                <w:b w:val="false"/>
+                <w:bCs w:val="false"/>
+                <w:i w:val="false"/>
+                <w:iCs w:val="false"/>
+                <w:sz w:val="21"/>
+                <w:szCs w:val="21"/>
+              </w:rPr>
+              <w:t xml:space="preserve">4</w:t>
+            </w:r>
+          </w:p>
+        </w:tc>
+        <w:tc>
+          <w:tcPr>
+            <w:tcW w:type="dxa" w:w="5738"/>
+            <w:tcBorders>
+              <w:top w:val="single" w:color="000000" w:sz="4"/>
+              <w:left w:val="single" w:color="000000" w:sz="4"/>
+              <w:bottom w:val="single" w:color="000000" w:sz="4"/>
+              <w:right w:val="single" w:color="000000" w:sz="4"/>
+            </w:tcBorders>
+            <w:tcMar>
+              <w:top w:type="dxa" w:w="60"/>
+              <w:left w:type="dxa" w:w="100"/>
+              <w:bottom w:type="dxa" w:w="60"/>
+              <w:right w:type="dxa" w:w="100"/>
+            </w:tcMar>
+            <w:vAlign w:val="center"/>
+          </w:tcPr>
+          <w:p>
+            <w:pPr>
+              <w:spacing w:line="240" w:lineRule="auto"/>
+              <w:jc w:val="left"/>
+            </w:pPr>
+            <w:r>
+              <w:rPr>
+                <w:rFonts w:ascii="Arial" w:cs="Arial" w:eastAsia="Arial" w:hAnsi="Arial"/>
+                <w:b w:val="false"/>
+                <w:bCs w:val="false"/>
+                <w:i w:val="false"/>
+                <w:iCs w:val="false"/>
+                <w:sz w:val="21"/>
+                <w:szCs w:val="21"/>
+              </w:rPr>
+              <w:t xml:space="preserve">CD(3) DSE — Executável: dist\Inclinometro2Eixos\ ou o instalador Setup.exe já compilados; alternativa ao par CD(1)+CD(2) quando não se quer instalar Python no computador de destino (seções 4.3/4.4)</w:t>
+            </w:r>
+          </w:p>
+        </w:tc>
+        <w:tc>
+          <w:tcPr>
+            <w:tcW w:type="dxa" w:w="1200"/>
+            <w:tcBorders>
+              <w:top w:val="single" w:color="000000" w:sz="4"/>
+              <w:left w:val="single" w:color="000000" w:sz="4"/>
+              <w:bottom w:val="single" w:color="000000" w:sz="4"/>
+              <w:right w:val="single" w:color="000000" w:sz="4"/>
+            </w:tcBorders>
+            <w:tcMar>
+              <w:top w:type="dxa" w:w="60"/>
+              <w:left w:type="dxa" w:w="100"/>
+              <w:bottom w:type="dxa" w:w="60"/>
+              <w:right w:type="dxa" w:w="100"/>
+            </w:tcMar>
+            <w:vAlign w:val="center"/>
+          </w:tcPr>
+          <w:p>
+            <w:pPr>
+              <w:spacing w:line="240" w:lineRule="auto"/>
+              <w:jc w:val="left"/>
+            </w:pPr>
+            <w:r>
+              <w:rPr>
+                <w:rFonts w:ascii="Arial" w:cs="Arial" w:eastAsia="Arial" w:hAnsi="Arial"/>
+                <w:b w:val="false"/>
+                <w:bCs w:val="false"/>
+                <w:i w:val="false"/>
+                <w:iCs w:val="false"/>
+                <w:sz w:val="21"/>
+                <w:szCs w:val="21"/>
+              </w:rPr>
+              <w:t xml:space="preserve">1</w:t>
+            </w:r>
+          </w:p>
+        </w:tc>
+        <w:tc>
+          <w:tcPr>
+            <w:tcW w:type="dxa" w:w="2000"/>
+            <w:tcBorders>
+              <w:top w:val="single" w:color="000000" w:sz="4"/>
+              <w:left w:val="single" w:color="000000" w:sz="4"/>
+              <w:bottom w:val="single" w:color="000000" w:sz="4"/>
+              <w:right w:val="single" w:color="000000" w:sz="4"/>
+            </w:tcBorders>
+            <w:tcMar>
+              <w:top w:type="dxa" w:w="60"/>
+              <w:left w:type="dxa" w:w="100"/>
+              <w:bottom w:type="dxa" w:w="60"/>
+              <w:right w:type="dxa" w:w="100"/>
+            </w:tcMar>
+            <w:vAlign w:val="center"/>
+          </w:tcPr>
+          <w:p>
+            <w:pPr>
+              <w:spacing w:line="240" w:lineRule="auto"/>
+              <w:jc w:val="left"/>
+            </w:pPr>
+            <w:r>
+              <w:rPr>
+                <w:rFonts w:ascii="Arial" w:cs="Arial" w:eastAsia="Arial" w:hAnsi="Arial"/>
+                <w:b w:val="false"/>
+                <w:bCs w:val="false"/>
+                <w:i w:val="false"/>
+                <w:iCs w:val="false"/>
+                <w:sz w:val="21"/>
+                <w:szCs w:val="21"/>
+              </w:rPr>
+              <w:t xml:space="preserve">DSE</w:t>
             </w:r>
           </w:p>
         </w:tc>
@@ -1049,7 +1195,7 @@
           <w:sz w:val="21"/>
           <w:szCs w:val="21"/>
         </w:rPr>
-        <w:t xml:space="preserve">Python 3.10+ pode vir pré-instalado no computador de destino, ou seu próprio instalador (offline) constar na mídia — o instalador oficial do Python, uma vez baixado, não precisa de internet para instalar.</w:t>
+        <w:t xml:space="preserve">Basta um dos dois caminhos: CD(1) + CD(2) (instalação a partir do código-fonte) OU CD(3) (executável/instalador já pronto) — não é necessário ter os três se a instalação usar só um dos caminhos.</w:t>
       </w:r>
     </w:p>
     <w:p>
@@ -1095,7 +1241,7 @@
           <w:sz w:val="21"/>
           <w:szCs w:val="21"/>
         </w:rPr>
-        <w:t xml:space="preserve">b) retirar a mídia (DVD/CD) correspondente do repositório físico da fábrica;</w:t>
+        <w:t xml:space="preserve">b) decidir o caminho de instalação: código-fonte (retirar CD(1) DAD e CD(2) DSF do repositório físico da fábrica) ou executável/instalador já compilado (retirar apenas CD(3) DSE);</w:t>
       </w:r>
     </w:p>
     <w:p>
@@ -1110,7 +1256,7 @@
           <w:sz w:val="21"/>
           <w:szCs w:val="21"/>
         </w:rPr>
-        <w:t xml:space="preserve">c) confirmar, na própria mídia, qual variante de instalação foi gravada: código-fonte + pacote offline (seção 4.2), executável autônomo (seção 4.3) ou instalador Setup.exe (seção 4.4) — as três são igualmente válidas e não exigem internet na máquina de destino;</w:t>
+        <w:t xml:space="preserve">c) confirmar, na própria mídia, a variante gravada: código-fonte + ambiente offline (seção 4.2), executável autônomo (seção 4.3) ou instalador Setup.exe (seção 4.4) — as três são igualmente válidas e não exigem internet na máquina de destino;</w:t>
       </w:r>
     </w:p>
     <w:p>
@@ -1125,7 +1271,7 @@
           <w:sz w:val="21"/>
           <w:szCs w:val="21"/>
         </w:rPr>
-        <w:t xml:space="preserve">d) copiar o conteúdo da mídia para o computador de destino (não é obrigatório rodar direto do DVD/CD).</w:t>
+        <w:t xml:space="preserve">d) copiar o conteúdo da mídia (ou mídias) para o computador de destino (não é obrigatório rodar direto do DVD/CD).</w:t>
       </w:r>
     </w:p>
     <w:p>
@@ -1158,7 +1304,7 @@
           <w:sz w:val="21"/>
           <w:szCs w:val="21"/>
         </w:rPr>
-        <w:t xml:space="preserve">4.1 Preparação da mídia offline (feita à parte, com internet — não é a instalação em si)</w:t>
+        <w:t xml:space="preserve">4.1 Preparação das mídias CD(1) DAD, CD(2) DSF e CD(3) DSE (feita à parte, com internet — não é a instalação em si)</w:t>
       </w:r>
     </w:p>
     <w:p>
@@ -1172,7 +1318,7 @@
           <w:sz w:val="21"/>
           <w:szCs w:val="21"/>
         </w:rPr>
-        <w:t xml:space="preserve">Esta etapa NÃO é executada no computador de destino em campo/fábrica. É feita uma única vez, por quem mantém o software, numa máquina com Python e internet, para gerar o conteúdo que será gravado na mídia e arquivado no repositório físico da fábrica.</w:t>
+        <w:t xml:space="preserve">Esta etapa NÃO é executada no computador de destino em campo/fábrica. É feita uma única vez por versão do software, por quem mantém o projeto, numa máquina com Python e internet, para gerar o conteúdo que será gravado em cada mídia e arquivado no repositório físico da fábrica.</w:t>
       </w:r>
     </w:p>
     <w:p>
@@ -1197,7 +1343,7 @@
           <w:sz w:val="21"/>
           <w:szCs w:val="21"/>
         </w:rPr>
-        <w:t xml:space="preserve">Numa máquina com internet, dar duplo clique em windows\build_offline_bundle.bat. Baixa todos os pacotes de requirements.txt (PyQt5, pymodbus, pyserial, bleak, reportlab, matplotlib) para windows\offline_packages.</w:t>
+        <w:t xml:space="preserve">CD(1) DAD: numa máquina com internet, dar duplo clique em windows\build_offline_bundle.bat. Baixa todos os pacotes de requirements.txt (PyQt5, pymodbus, pyserial, bleak — incluindo o backend Bluetooth do Windows — reportlab, matplotlib, numpy) para windows\offline_packages. Gravar essa pasta, junto com o instalador oficial do Python 3.10+ para Windows (baixado uma vez em https://www.python.org/downloads/windows/), no CD(1) DAD.</w:t>
       </w:r>
     </w:p>
     <w:p>
@@ -1222,7 +1368,7 @@
           <w:sz w:val="21"/>
           <w:szCs w:val="21"/>
         </w:rPr>
-        <w:t xml:space="preserve">Gravar a pasta python-app inteira (já incluindo windows\offline_packages) no DVD/CD.</w:t>
+        <w:t xml:space="preserve">CD(2) DSF: gravar a pasta python-app inteira (código-fonte, sem windows\offline_packages — esse fica só no CD(1)) no CD(2) DSF.</w:t>
       </w:r>
     </w:p>
     <w:p>
@@ -1247,7 +1393,32 @@
           <w:sz w:val="21"/>
           <w:szCs w:val="21"/>
         </w:rPr>
-        <w:t xml:space="preserve">Arquivar a mídia no repositório físico da fábrica, identificada com a versão do software (python-app/app_version.py) e a data de preparação.</w:t>
+        <w:t xml:space="preserve">CD(3) DSE (opcional, alternativa aos dois acima): usando o CD(1) e o CD(2) já preparados numa máquina Windows, rodar windows\build_exe.bat (gera dist\Inclinometro2Eixos\) ou windows\build_installer.bat (gera o instalador Setup.exe, exige Inno Setup só nesta máquina de geração) e gravar o resultado no CD(3) DSE.</w:t>
+      </w:r>
+    </w:p>
+    <w:p>
+      <w:pPr>
+        <w:spacing w:after="100" w:line="264" w:lineRule="auto"/>
+        <w:ind w:left="500" w:hanging="300"/>
+        <w:jc w:val="both"/>
+      </w:pPr>
+      <w:r>
+        <w:rPr>
+          <w:rFonts w:ascii="Arial" w:cs="Arial" w:eastAsia="Arial" w:hAnsi="Arial"/>
+          <w:b/>
+          <w:bCs/>
+          <w:sz w:val="21"/>
+          <w:szCs w:val="21"/>
+        </w:rPr>
+        <w:t xml:space="preserve">4. </w:t>
+      </w:r>
+      <w:r>
+        <w:rPr>
+          <w:rFonts w:ascii="Arial" w:cs="Arial" w:eastAsia="Arial" w:hAnsi="Arial"/>
+          <w:sz w:val="21"/>
+          <w:szCs w:val="21"/>
+        </w:rPr>
+        <w:t xml:space="preserve">Arquivar as mídias no repositório físico da fábrica, identificadas com a versão do software (python-app/app_version.py) e a data de preparação.</w:t>
       </w:r>
     </w:p>
     <w:p>
@@ -1264,7 +1435,7 @@
           <w:sz w:val="21"/>
           <w:szCs w:val="21"/>
         </w:rPr>
-        <w:t xml:space="preserve">4.2 Instalação a partir do código-fonte + pacote offline (recomendada para desenvolvimento/manutenção)</w:t>
+        <w:t xml:space="preserve">4.2 Instalação a partir do CD(1) DAD + CD(2) DSF (código-fonte — recomendada para desenvolvimento/manutenção)</w:t>
       </w:r>
     </w:p>
     <w:p>
@@ -1289,7 +1460,7 @@
           <w:sz w:val="21"/>
           <w:szCs w:val="21"/>
         </w:rPr>
-        <w:t xml:space="preserve">Copiar a pasta python-app da mídia (DVD/CD) para o computador Windows de destino.</w:t>
+        <w:t xml:space="preserve">Copiar a pasta python-app do CD(2) DSF para o computador Windows de destino.</w:t>
       </w:r>
     </w:p>
     <w:p>
@@ -1314,7 +1485,7 @@
           <w:sz w:val="21"/>
           <w:szCs w:val="21"/>
         </w:rPr>
-        <w:t xml:space="preserve">Dar duplo clique em windows\install.bat. O script detecta automaticamente a pasta windows\offline_packages e instala as dependências a partir dela, sem tentar acessar a internet.</w:t>
+        <w:t xml:space="preserve">Copiar a pasta offline_packages do CD(1) DAD para dentro de python-app\windows\offline_packages.</w:t>
       </w:r>
     </w:p>
     <w:p>
@@ -1339,6 +1510,56 @@
           <w:sz w:val="21"/>
           <w:szCs w:val="21"/>
         </w:rPr>
+        <w:t xml:space="preserve">Se o Python 3.10+ ainda não estiver instalado, executar o instalador do CD(1) DAD marcando "Add python.exe to PATH".</w:t>
+      </w:r>
+    </w:p>
+    <w:p>
+      <w:pPr>
+        <w:spacing w:after="100" w:line="264" w:lineRule="auto"/>
+        <w:ind w:left="500" w:hanging="300"/>
+        <w:jc w:val="both"/>
+      </w:pPr>
+      <w:r>
+        <w:rPr>
+          <w:rFonts w:ascii="Arial" w:cs="Arial" w:eastAsia="Arial" w:hAnsi="Arial"/>
+          <w:b/>
+          <w:bCs/>
+          <w:sz w:val="21"/>
+          <w:szCs w:val="21"/>
+        </w:rPr>
+        <w:t xml:space="preserve">4. </w:t>
+      </w:r>
+      <w:r>
+        <w:rPr>
+          <w:rFonts w:ascii="Arial" w:cs="Arial" w:eastAsia="Arial" w:hAnsi="Arial"/>
+          <w:sz w:val="21"/>
+          <w:szCs w:val="21"/>
+        </w:rPr>
+        <w:t xml:space="preserve">Dar duplo clique em windows\install.bat. O script detecta automaticamente a pasta windows\offline_packages e instala as dependências a partir dela, sem tentar acessar a internet.</w:t>
+      </w:r>
+    </w:p>
+    <w:p>
+      <w:pPr>
+        <w:spacing w:after="100" w:line="264" w:lineRule="auto"/>
+        <w:ind w:left="500" w:hanging="300"/>
+        <w:jc w:val="both"/>
+      </w:pPr>
+      <w:r>
+        <w:rPr>
+          <w:rFonts w:ascii="Arial" w:cs="Arial" w:eastAsia="Arial" w:hAnsi="Arial"/>
+          <w:b/>
+          <w:bCs/>
+          <w:sz w:val="21"/>
+          <w:szCs w:val="21"/>
+        </w:rPr>
+        <w:t xml:space="preserve">5. </w:t>
+      </w:r>
+      <w:r>
+        <w:rPr>
+          <w:rFonts w:ascii="Arial" w:cs="Arial" w:eastAsia="Arial" w:hAnsi="Arial"/>
+          <w:sz w:val="21"/>
+          <w:szCs w:val="21"/>
+        </w:rPr>
         <w:t xml:space="preserve">Para abrir o software (nesta e nas próximas vezes), dar duplo clique em windows\run.bat.</w:t>
       </w:r>
     </w:p>
@@ -1353,7 +1574,7 @@
           <w:sz w:val="21"/>
           <w:szCs w:val="21"/>
         </w:rPr>
-        <w:t xml:space="preserve">Se windows\offline_packages não estiver presente na mídia, install.bat tenta instalar pela internet — caminho válido apenas em ambiente de desenvolvimento, nunca em campo/fábrica.</w:t>
+        <w:t xml:space="preserve">Se windows\offline_packages não estiver presente (CD(1) não copiado), install.bat tenta instalar pela internet — caminho válido apenas em ambiente de desenvolvimento, nunca em campo/fábrica.</w:t>
       </w:r>
     </w:p>
     <w:p>
@@ -1370,7 +1591,7 @@
           <w:sz w:val="21"/>
           <w:szCs w:val="21"/>
         </w:rPr>
-        <w:t xml:space="preserve">4.3 Instalação a partir do executável autônomo (alternativa sem Python)</w:t>
+        <w:t xml:space="preserve">4.3 Instalação a partir do CD(3) DSE — executável autônomo (alternativa sem Python)</w:t>
       </w:r>
     </w:p>
     <w:p>
@@ -1384,7 +1605,7 @@
           <w:sz w:val="21"/>
           <w:szCs w:val="21"/>
         </w:rPr>
-        <w:t xml:space="preserve">Aplicável quando a mídia traz o executável já gerado (dist\Inclinometro2Eixos\), preparado previamente por quem mantém o software. Não exige Python nem internet no computador de destino.</w:t>
+        <w:t xml:space="preserve">Aplicável quando o CD(3) DSE traz o executável já gerado (dist\Inclinometro2Eixos\), preparado previamente por quem mantém o software (seção 4.1, passo 3). Não exige Python, CD(1) DAD, CD(2) DSF nem internet no computador de destino.</w:t>
       </w:r>
     </w:p>
     <w:p>
@@ -1409,7 +1630,7 @@
           <w:sz w:val="21"/>
           <w:szCs w:val="21"/>
         </w:rPr>
-        <w:t xml:space="preserve">Copiar a pasta dist\Inclinometro2Eixos inteira da mídia para o computador de destino.</w:t>
+        <w:t xml:space="preserve">Copiar a pasta dist\Inclinometro2Eixos inteira do CD(3) DSE para o computador de destino.</w:t>
       </w:r>
     </w:p>
     <w:p>
@@ -1451,7 +1672,7 @@
           <w:sz w:val="21"/>
           <w:szCs w:val="21"/>
         </w:rPr>
-        <w:t xml:space="preserve">4.4 Instalação a partir do instalador (Setup.exe)</w:t>
+        <w:t xml:space="preserve">4.4 Instalação a partir do CD(3) DSE — instalador (Setup.exe)</w:t>
       </w:r>
     </w:p>
     <w:p>
@@ -1465,7 +1686,7 @@
           <w:sz w:val="21"/>
           <w:szCs w:val="21"/>
         </w:rPr>
-        <w:t xml:space="preserve">Aplicável quando a mídia traz o instalador já gerado (Inclinometro-2Eixos-Setup-2.0.0.exe). Não exige Python, Inno Setup nem internet no computador de destino.</w:t>
+        <w:t xml:space="preserve">Aplicável quando o CD(3) DSE traz o instalador já gerado (Inclinometro-2Eixos-Setup-2.0.0.exe). Não exige Python, CD(1) DAD, CD(2) DSF, Inno Setup nem internet no computador de destino.</w:t>
       </w:r>
     </w:p>
     <w:p>
@@ -1490,7 +1711,7 @@
           <w:sz w:val="21"/>
           <w:szCs w:val="21"/>
         </w:rPr>
-        <w:t xml:space="preserve">Copiar o arquivo .exe da mídia para o computador de destino e executá-lo.</w:t>
+        <w:t xml:space="preserve">Copiar o arquivo .exe do CD(3) DSE para o computador de destino e executá-lo.</w:t>
       </w:r>
     </w:p>
     <w:p>
@@ -2559,7 +2780,7 @@
                 <w:sz w:val="21"/>
                 <w:szCs w:val="21"/>
               </w:rPr>
-              <w:t xml:space="preserve">Mídia gravada com windows\offline_packages incompleto ou desatualizado em relação a requirements.txt</w:t>
+              <w:t xml:space="preserve">CD(1) DAD com windows\offline_packages incompleto ou desatualizado em relação a requirements.txt</w:t>
             </w:r>
           </w:p>
         </w:tc>
@@ -2595,7 +2816,7 @@
                 <w:sz w:val="21"/>
                 <w:szCs w:val="21"/>
               </w:rPr>
-              <w:t xml:space="preserve">Solicitar mídia atualizada, gerada com build_offline_bundle.bat (seção 4.1) numa máquina com internet; nunca tentar instalar pela internet no computador de campo/fábrica</w:t>
+              <w:t xml:space="preserve">Solicitar CD(1) DAD atualizado, gerado com build_offline_bundle.bat (seção 4.1) numa máquina com internet; nunca tentar instalar pela internet no computador de campo/fábrica</w:t>
             </w:r>
           </w:p>
         </w:tc>
@@ -2705,7 +2926,7 @@
                 <w:sz w:val="21"/>
                 <w:szCs w:val="21"/>
               </w:rPr>
-              <w:t xml:space="preserve">Ver "Antivírus/SmartScreen" em python-app/windows/INSTALACAO_WINDOWS.md; solicitar mídia gerada novamente num Windows real</w:t>
+              <w:t xml:space="preserve">Ver "Antivírus/SmartScreen" em python-app/windows/INSTALACAO_WINDOWS.md; solicitar CD(3) DSE gerado novamente num Windows real</w:t>
             </w:r>
           </w:p>
         </w:tc>

</xml_diff>

<commit_message>
Remove o CD(1) DAD do fluxo de instalação do software Python
O DAD é só uma exigência de garantia/rastreabilidade da fábrica (mídia
arquivada com o ambiente de desenvolvimento preservado, com o mesmo
conteúdo do CD(2) DSF) — nunca é retirado do repositório físico durante
a instalação, nem mesmo no caminho de desenvolvimento/manutenção.

A instalação do software Python passa a usar só duas mídias: CD(3) DSE
(operador final, seção 4.1/4.2) e CD(2) DSF (desenvolvimento/manutenção,
seção 4.3, agora com o Python portátil e o VSCodium incluídos nela em vez
do CD(1)). O DAD é mencionado só como nota explicativa (equipamentos,
objetivo, ANEXO A) e no diagrama de setup deixa de aparecer como uma
mídia usada no fluxo.

Ajusta também install.bat e build_offline_bundle.bat, que instruíam o
operador/desenvolvedor a buscar arquivos no CD(1) DAD durante a
instalação.
</commit_message>
<xml_diff>
--- a/docs/procedimento-instalacao-software-python.docx
+++ b/docs/procedimento-instalacao-software-python.docx
@@ -412,7 +412,7 @@
                 <w:sz w:val="21"/>
                 <w:szCs w:val="21"/>
               </w:rPr>
-              <w:t xml:space="preserve">Instalar para desenvolvimento/manutenção do software: use o CD(1) DAD + CD(2) DSF, seções 4.2/4.3.</w:t>
+              <w:t xml:space="preserve">Instalar para desenvolvimento/manutenção do software: use o CD(2) DSF, seção 4.3.</w:t>
             </w:r>
           </w:p>
           <w:p>
@@ -473,7 +473,7 @@
           <w:sz w:val="21"/>
           <w:szCs w:val="21"/>
         </w:rPr>
-        <w:t xml:space="preserve">IMPORTANTE: em nenhum momento da instalação — em qualquer um dos caminhos desta seção — é permitido ou necessário usar internet no computador de destino. As três mídias (CD(1) DAD, CD(2) DSF, CD(3) DSE) já contêm tudo o que a instalação exige, sem depender de baixar mais nada nem de outra pessoa preparar algo na hora. A preparação dessas mídias (que exige internet) é atividade separada, de quem mantém o software, feita antes e em outro computador — ver o ANEXO A no fim deste documento, que não faz parte da sequência de instalação.</w:t>
+        <w:t xml:space="preserve">IMPORTANTE: em nenhum momento da instalação — em qualquer um dos caminhos desta seção — é permitido ou necessário usar internet no computador de destino. As mídias usadas na instalação (CD(2) DSF e CD(3) DSE) já contêm tudo o que a instalação exige, sem depender de baixar mais nada nem de outra pessoa preparar algo na hora. A preparação dessas mídias (que exige internet) é atividade separada, de quem mantém o software, feita antes e em outro computador — ver o ANEXO A no fim deste documento, que não faz parte da sequência de instalação. O CD(1) DAD não entra nesta instalação: é uma mídia arquivada só como garantia/regra da fábrica (registro de que o ambiente de desenvolvimento existe e está preservado), sem uso em nenhum passo abaixo.</w:t>
       </w:r>
     </w:p>
     <w:p>
@@ -1068,153 +1068,7 @@
                 <w:sz w:val="21"/>
                 <w:szCs w:val="21"/>
               </w:rPr>
-              <w:t xml:space="preserve">CD(1) DAD — Ambiente de Desenvolvimento: Python 3.10 portátil (sem instalador), instalador do VS Code e o pacote offline_packages, todos já incluídos na mídia; só para instalação a partir do código-fonte, em máquina de desenvolvimento/manutenção (seção 4.3)</w:t>
-            </w:r>
-          </w:p>
-        </w:tc>
-        <w:tc>
-          <w:tcPr>
-            <w:tcW w:type="dxa" w:w="1200"/>
-            <w:tcBorders>
-              <w:top w:val="single" w:color="000000" w:sz="4"/>
-              <w:left w:val="single" w:color="000000" w:sz="4"/>
-              <w:bottom w:val="single" w:color="000000" w:sz="4"/>
-              <w:right w:val="single" w:color="000000" w:sz="4"/>
-            </w:tcBorders>
-            <w:tcMar>
-              <w:top w:type="dxa" w:w="60"/>
-              <w:left w:type="dxa" w:w="100"/>
-              <w:bottom w:type="dxa" w:w="60"/>
-              <w:right w:type="dxa" w:w="100"/>
-            </w:tcMar>
-            <w:vAlign w:val="center"/>
-          </w:tcPr>
-          <w:p>
-            <w:pPr>
-              <w:spacing w:line="240" w:lineRule="auto"/>
-              <w:jc w:val="left"/>
-            </w:pPr>
-            <w:r>
-              <w:rPr>
-                <w:rFonts w:ascii="Arial" w:cs="Arial" w:eastAsia="Arial" w:hAnsi="Arial"/>
-                <w:b w:val="false"/>
-                <w:bCs w:val="false"/>
-                <w:i w:val="false"/>
-                <w:iCs w:val="false"/>
-                <w:sz w:val="21"/>
-                <w:szCs w:val="21"/>
-              </w:rPr>
-              <w:t xml:space="preserve">1</w:t>
-            </w:r>
-          </w:p>
-        </w:tc>
-        <w:tc>
-          <w:tcPr>
-            <w:tcW w:type="dxa" w:w="2000"/>
-            <w:tcBorders>
-              <w:top w:val="single" w:color="000000" w:sz="4"/>
-              <w:left w:val="single" w:color="000000" w:sz="4"/>
-              <w:bottom w:val="single" w:color="000000" w:sz="4"/>
-              <w:right w:val="single" w:color="000000" w:sz="4"/>
-            </w:tcBorders>
-            <w:tcMar>
-              <w:top w:type="dxa" w:w="60"/>
-              <w:left w:type="dxa" w:w="100"/>
-              <w:bottom w:type="dxa" w:w="60"/>
-              <w:right w:type="dxa" w:w="100"/>
-            </w:tcMar>
-            <w:vAlign w:val="center"/>
-          </w:tcPr>
-          <w:p>
-            <w:pPr>
-              <w:spacing w:line="240" w:lineRule="auto"/>
-              <w:jc w:val="left"/>
-            </w:pPr>
-            <w:r>
-              <w:rPr>
-                <w:rFonts w:ascii="Arial" w:cs="Arial" w:eastAsia="Arial" w:hAnsi="Arial"/>
-                <w:b w:val="false"/>
-                <w:bCs w:val="false"/>
-                <w:i w:val="false"/>
-                <w:iCs w:val="false"/>
-                <w:sz w:val="21"/>
-                <w:szCs w:val="21"/>
-              </w:rPr>
-              <w:t xml:space="preserve">DAD</w:t>
-            </w:r>
-          </w:p>
-        </w:tc>
-      </w:tr>
-      <w:tr>
-        <w:tc>
-          <w:tcPr>
-            <w:tcW w:type="dxa" w:w="700"/>
-            <w:tcBorders>
-              <w:top w:val="single" w:color="000000" w:sz="4"/>
-              <w:left w:val="single" w:color="000000" w:sz="4"/>
-              <w:bottom w:val="single" w:color="000000" w:sz="4"/>
-              <w:right w:val="single" w:color="000000" w:sz="4"/>
-            </w:tcBorders>
-            <w:tcMar>
-              <w:top w:type="dxa" w:w="60"/>
-              <w:left w:type="dxa" w:w="100"/>
-              <w:bottom w:type="dxa" w:w="60"/>
-              <w:right w:type="dxa" w:w="100"/>
-            </w:tcMar>
-            <w:vAlign w:val="center"/>
-          </w:tcPr>
-          <w:p>
-            <w:pPr>
-              <w:spacing w:line="240" w:lineRule="auto"/>
-              <w:jc w:val="left"/>
-            </w:pPr>
-            <w:r>
-              <w:rPr>
-                <w:rFonts w:ascii="Arial" w:cs="Arial" w:eastAsia="Arial" w:hAnsi="Arial"/>
-                <w:b w:val="false"/>
-                <w:bCs w:val="false"/>
-                <w:i w:val="false"/>
-                <w:iCs w:val="false"/>
-                <w:sz w:val="21"/>
-                <w:szCs w:val="21"/>
-              </w:rPr>
-              <w:t xml:space="preserve">4</w:t>
-            </w:r>
-          </w:p>
-        </w:tc>
-        <w:tc>
-          <w:tcPr>
-            <w:tcW w:type="dxa" w:w="5738"/>
-            <w:tcBorders>
-              <w:top w:val="single" w:color="000000" w:sz="4"/>
-              <w:left w:val="single" w:color="000000" w:sz="4"/>
-              <w:bottom w:val="single" w:color="000000" w:sz="4"/>
-              <w:right w:val="single" w:color="000000" w:sz="4"/>
-            </w:tcBorders>
-            <w:tcMar>
-              <w:top w:type="dxa" w:w="60"/>
-              <w:left w:type="dxa" w:w="100"/>
-              <w:bottom w:type="dxa" w:w="60"/>
-              <w:right w:type="dxa" w:w="100"/>
-            </w:tcMar>
-            <w:vAlign w:val="center"/>
-          </w:tcPr>
-          <w:p>
-            <w:pPr>
-              <w:spacing w:line="240" w:lineRule="auto"/>
-              <w:jc w:val="left"/>
-            </w:pPr>
-            <w:r>
-              <w:rPr>
-                <w:rFonts w:ascii="Arial" w:cs="Arial" w:eastAsia="Arial" w:hAnsi="Arial"/>
-                <w:b w:val="false"/>
-                <w:bCs w:val="false"/>
-                <w:i w:val="false"/>
-                <w:iCs w:val="false"/>
-                <w:sz w:val="21"/>
-                <w:szCs w:val="21"/>
-              </w:rPr>
-              <w:t xml:space="preserve">CD(2) DSF — Código Fonte: pasta python-app completa; só para instalação a partir do código-fonte, em máquina de desenvolvimento/manutenção (seção 4.3)</w:t>
+              <w:t xml:space="preserve">CD(2) DSF — Código Fonte: pasta python-app completa, incluindo Python 3.10 portátil (sem instalador), instalador do VSCodium e o pacote offline_packages, todos já incluídos na mídia; só para instalação a partir do código-fonte, em máquina de desenvolvimento/manutenção (seção 4.3)</w:t>
             </w:r>
           </w:p>
         </w:tc>
@@ -1303,7 +1157,7 @@
           <w:sz w:val="21"/>
           <w:szCs w:val="21"/>
         </w:rPr>
-        <w:t xml:space="preserve">Para instalar no computador de um operador final, basta o CD(3) DSE (item 2) — não é necessário separar CD(1) e CD(2) nesse caso. O par CD(1)+CD(2) só é retirado do repositório físico da fábrica quando a instalação for para fins de desenvolvimento ou manutenção do próprio software (seção 4.3).</w:t>
+        <w:t xml:space="preserve">Para instalar no computador de um operador final, basta o CD(3) DSE (item 2). O CD(2) DSF só é retirado do repositório físico da fábrica quando a instalação for para fins de desenvolvimento ou manutenção do próprio software (seção 4.3). O CD(1) DAD não é usado em nenhum dos dois casos — fica arquivado no repositório físico da fábrica apenas como garantia/regra da fábrica, sem participar da instalação.</w:t>
       </w:r>
     </w:p>
     <w:p>
@@ -1381,7 +1235,7 @@
           <w:sz w:val="18"/>
           <w:szCs w:val="18"/>
         </w:rPr>
-        <w:t xml:space="preserve">Figura 1 — Diagrama em blocos do setup de instalação: os dois caminhos (operador final via CD(3) DSE; desenvolvimento/manutenção via CD(1) DAD + CD(2) DSF) e o resultado em cada um. Fonte editável (SVG): docs/diagramas/diagrama-setup-instalacao.svg.</w:t>
+        <w:t xml:space="preserve">Figura 1 — Diagrama em blocos do setup de instalação: os dois caminhos (operador final via CD(3) DSE; desenvolvimento/manutenção via CD(2) DSF) e o resultado em cada um. O CD(1) DAD fica arquivado como garantia da fábrica e não participa da instalação. Fonte editável (SVG): docs/diagramas/diagrama-setup-instalacao.svg.</w:t>
       </w:r>
     </w:p>
     <w:p>
@@ -1426,7 +1280,7 @@
           <w:sz w:val="21"/>
           <w:szCs w:val="21"/>
         </w:rPr>
-        <w:t xml:space="preserve">c) se for instalação para desenvolvimento/manutenção do software: retirar o CD(1) DAD e o CD(2) DSF, e seguir a seção 4.3;</w:t>
+        <w:t xml:space="preserve">c) se for instalação para desenvolvimento/manutenção do software: retirar o CD(2) DSF, e seguir a seção 4.3;</w:t>
       </w:r>
     </w:p>
     <w:p>
@@ -1488,7 +1342,7 @@
           <w:sz w:val="21"/>
           <w:szCs w:val="21"/>
         </w:rPr>
-        <w:t xml:space="preserve">Este é o caminho a usar sempre que quem vai operar o software não for programador. O instalador cria um ícone na Área de Trabalho e uma entrada no Menu Iniciar, com a logo da Avibras Aeroco, e o software abre com duplo clique como qualquer outro programa do Windows — sem terminal, sem script .bat, sem editor de código, e sem internet em nenhum momento. Aplicável quando o CD(3) DSE traz o instalador já gerado (Inclinometro-2Eixos-Setup-2.0.0.exe). Não exige Python, CD(1) DAD, CD(2) DSF nem Inno Setup no computador de destino.</w:t>
+        <w:t xml:space="preserve">Este é o caminho a usar sempre que quem vai operar o software não for programador. O instalador cria um ícone na Área de Trabalho e uma entrada no Menu Iniciar, com a logo da Avibras Aeroco, e o software abre com duplo clique como qualquer outro programa do Windows — sem terminal, sem script .bat, sem editor de código, e sem internet em nenhum momento. Aplicável quando o CD(3) DSE traz o instalador já gerado (Inclinometro-2Eixos-Setup-2.0.0.exe). Não exige Python, CD(2) DSF nem Inno Setup no computador de destino.</w:t>
       </w:r>
     </w:p>
     <w:p>
@@ -1594,7 +1448,7 @@
           <w:sz w:val="21"/>
           <w:szCs w:val="21"/>
         </w:rPr>
-        <w:t xml:space="preserve">Aplicável quando o CD(3) DSE traz a pasta já gerada (dist\Inclinometro2Eixos\), preparada previamente por quem mantém o software (ANEXO A). Não exige Python, CD(1) DAD, CD(2) DSF nem internet no computador de destino — mas também não cria ícone na Área de Trabalho nem no Menu Iniciar, e mistura o .exe com vários outros arquivos (bibliotecas) na mesma pasta. Usar apenas para testes rápidos por quem já sabe o que está fazendo; para instalar no computador de um operador final, usar a seção 4.1.</w:t>
+        <w:t xml:space="preserve">Aplicável quando o CD(3) DSE traz a pasta já gerada (dist\Inclinometro2Eixos\), preparada previamente por quem mantém o software (ANEXO A). Não exige Python, CD(2) DSF nem internet no computador de destino — mas também não cria ícone na Área de Trabalho nem no Menu Iniciar, e mistura o .exe com vários outros arquivos (bibliotecas) na mesma pasta. Usar apenas para testes rápidos por quem já sabe o que está fazendo; para instalar no computador de um operador final, usar a seção 4.1.</w:t>
       </w:r>
     </w:p>
     <w:p>
@@ -1661,7 +1515,7 @@
           <w:sz w:val="21"/>
           <w:szCs w:val="21"/>
         </w:rPr>
-        <w:t xml:space="preserve">4.3 Instalação a partir do CD(1) DAD + CD(2) DSF (código-fonte — só para desenvolvimento/manutenção, NÃO para o operador final)</w:t>
+        <w:t xml:space="preserve">4.3 Instalação a partir do CD(2) DSF (código-fonte — só para desenvolvimento/manutenção, NÃO para o operador final)</w:t>
       </w:r>
     </w:p>
     <w:p>
@@ -1700,7 +1554,7 @@
           <w:sz w:val="21"/>
           <w:szCs w:val="21"/>
         </w:rPr>
-        <w:t xml:space="preserve">Copiar a pasta python-app do CD(2) DSF para o computador Windows de destino.</w:t>
+        <w:t xml:space="preserve">Copiar a pasta python-app inteira do CD(2) DSF para o computador Windows de destino — essa pasta já inclui o código-fonte, o Python portátil e o pacote offline_packages.</w:t>
       </w:r>
     </w:p>
     <w:p>
@@ -1725,7 +1579,7 @@
           <w:sz w:val="21"/>
           <w:szCs w:val="21"/>
         </w:rPr>
-        <w:t xml:space="preserve">Copiar a pasta "python" de dentro de python-3.10.21-portable-win64\ (no CD(1) DAD) para python-app\windows\python-portable — ou seja, o caminho final deve ser python-app\windows\python-portable\python.exe. É uma distribuição Python pronta para uso, sem instalador: não precisa executar nada, só copiar a pasta.</w:t>
+        <w:t xml:space="preserve">Copiar a pasta "python" de dentro de python-3.10.21-portable-win64\ (no CD(2) DSF) para python-app\windows\python-portable — ou seja, o caminho final deve ser python-app\windows\python-portable\python.exe. É uma distribuição Python pronta para uso, sem instalador: não precisa executar nada, só copiar a pasta.</w:t>
       </w:r>
     </w:p>
     <w:p>
@@ -1750,7 +1604,7 @@
           <w:sz w:val="21"/>
           <w:szCs w:val="21"/>
         </w:rPr>
-        <w:t xml:space="preserve">Copiar a pasta offline_packages do CD(1) DAD para dentro de python-app\windows\offline_packages.</w:t>
+        <w:t xml:space="preserve">Copiar a pasta offline_packages do CD(2) DSF para dentro de python-app\windows\offline_packages.</w:t>
       </w:r>
     </w:p>
     <w:p>
@@ -1775,7 +1629,7 @@
           <w:sz w:val="21"/>
           <w:szCs w:val="21"/>
         </w:rPr>
-        <w:t xml:space="preserve">Se for editar o código (não apenas rodá-lo), executar o instalador do VS Code (VSCodiumUserSetup-x64-*.exe) do CD(1) DAD — não precisa de direitos de administrador — e abrir a pasta python-app por ele.</w:t>
+        <w:t xml:space="preserve">Se for editar o código (não apenas rodá-lo), executar o instalador do VS Code (VSCodiumUserSetup-x64-*.exe) do CD(2) DSF — não precisa de direitos de administrador — e abrir a pasta python-app por ele.</w:t>
       </w:r>
     </w:p>
     <w:p>
@@ -2905,7 +2759,7 @@
                 <w:sz w:val="21"/>
                 <w:szCs w:val="21"/>
               </w:rPr>
-              <w:t xml:space="preserve">Copiar a pasta "python" do CD(1) DAD para python-app\windows\python-portable, conforme a seção 4.3</w:t>
+              <w:t xml:space="preserve">Copiar a pasta "python" do CD(2) DSF para python-app\windows\python-portable, conforme a seção 4.3</w:t>
             </w:r>
           </w:p>
         </w:tc>
@@ -2979,7 +2833,7 @@
                 <w:sz w:val="21"/>
                 <w:szCs w:val="21"/>
               </w:rPr>
-              <w:t xml:space="preserve">CD(1) DAD com windows\offline_packages incompleto ou desatualizado em relação a requirements.txt</w:t>
+              <w:t xml:space="preserve">CD(2) DSF com windows\offline_packages incompleto ou desatualizado em relação a requirements.txt</w:t>
             </w:r>
           </w:p>
         </w:tc>
@@ -3015,7 +2869,7 @@
                 <w:sz w:val="21"/>
                 <w:szCs w:val="21"/>
               </w:rPr>
-              <w:t xml:space="preserve">Solicitar CD(1) DAD atualizado, gerado conforme o ANEXO A; nunca tentar instalar pela internet no computador de campo/fábrica</w:t>
+              <w:t xml:space="preserve">Solicitar CD(2) DSF atualizado, gerado conforme o ANEXO A; nunca tentar instalar pela internet no computador de campo/fábrica</w:t>
             </w:r>
           </w:p>
         </w:tc>
@@ -3254,7 +3108,7 @@
           <w:sz w:val="22"/>
           <w:szCs w:val="22"/>
         </w:rPr>
-        <w:t xml:space="preserve">ANEXO A — PREPARAÇÃO DAS MÍDIAS CD(1) DAD, CD(2) DSF E CD(3) DSE</w:t>
+        <w:t xml:space="preserve">ANEXO A — PREPARAÇÃO DAS MÍDIAS CD(2) DSF, CD(3) DSE E ARQUIVAMENTO DO CD(1) DAD</w:t>
       </w:r>
     </w:p>
     <w:tbl>
@@ -3345,7 +3199,7 @@
           <w:sz w:val="21"/>
           <w:szCs w:val="21"/>
         </w:rPr>
-        <w:t xml:space="preserve">CD(1) DAD: numa máquina com internet, dar duplo clique em windows\build_offline_bundle.bat. Baixa todos os pacotes de requirements.txt (PyQt5, pymodbus, pyserial, bleak — incluindo o backend Bluetooth do Windows — reportlab, matplotlib, numpy) para windows\offline_packages. Gravar essa pasta no CD(1) DAD, junto com uma distribuição Python 3.10 portátil para Windows (ex.: python-build-standalone, install_only, x86_64-pc-windows-msvc — ou o instalador oficial em python.org/downloads/windows, se preferir) e o instalador do VS Code ("User Installer" x64, code.visualstudio.com/download — ou o instalador do VSCodium, equivalente sem telemetria, em github.com/VSCodium/vscodium/releases).</w:t>
+        <w:t xml:space="preserve">CD(2) DSF: numa máquina com internet, dar duplo clique em windows\build_offline_bundle.bat. Baixa todos os pacotes de requirements.txt (PyQt5, pymodbus, pyserial, bleak — incluindo o backend Bluetooth do Windows — reportlab, matplotlib, numpy) para windows\offline_packages. Gravar a pasta python-app inteira (código-fonte + windows\offline_packages), junto com uma distribuição Python 3.10 portátil para Windows (ex.: python-build-standalone, install_only, x86_64-pc-windows-msvc — ou o instalador oficial em python.org/downloads/windows, se preferir) e o instalador do VS Code ("User Installer" x64, code.visualstudio.com/download — ou o instalador do VSCodium, equivalente sem telemetria, em github.com/VSCodium/vscodium/releases), no CD(2) DSF.</w:t>
       </w:r>
     </w:p>
     <w:p>
@@ -3370,7 +3224,7 @@
           <w:sz w:val="21"/>
           <w:szCs w:val="21"/>
         </w:rPr>
-        <w:t xml:space="preserve">CD(2) DSF: gravar a pasta python-app inteira (código-fonte, sem windows\offline_packages e sem windows\python-portable — esses ficam só no CD(1)) no CD(2) DSF.</w:t>
+        <w:t xml:space="preserve">CD(1) DAD (exigência de garantia/rastreabilidade da fábrica, sem uso na instalação): gravar mais uma cópia idêntica de todo o conteúdo do CD(2) DSF (passo 1), identificada como CD(1) DAD, e arquivar junto às demais mídias. A regra da fábrica exige manter um ambiente de desenvolvimento completo registrado em mídia — mas esse CD nunca é retirado do repositório físico durante a instalação (seção 4), só em auditoria.</w:t>
       </w:r>
     </w:p>
     <w:p>
@@ -3395,7 +3249,7 @@
           <w:sz w:val="21"/>
           <w:szCs w:val="21"/>
         </w:rPr>
-        <w:t xml:space="preserve">CD(3) DSE (opcional, alternativa ao par CD(1)+CD(2) para quem só quer instalar, não desenvolver): usando o CD(1) e o CD(2) já preparados numa máquina Windows, rodar windows\build_exe.bat (gera dist\Inclinometro2Eixos\) ou windows\build_installer.bat (gera o instalador Setup.exe, exige Inno Setup só nesta máquina de geração) e gravar o resultado no CD(3) DSE.</w:t>
+        <w:t xml:space="preserve">CD(3) DSE (opcional, alternativa ao CD(2) DSF para quem só quer instalar, não desenvolver): usando o CD(2) DSF já preparado numa máquina Windows, rodar windows\build_exe.bat (gera dist\Inclinometro2Eixos\) ou windows\build_installer.bat (gera o instalador Setup.exe, exige Inno Setup só nesta máquina de geração) e gravar o resultado no CD(3) DSE.</w:t>
       </w:r>
     </w:p>
     <w:p>
@@ -3420,7 +3274,7 @@
           <w:sz w:val="21"/>
           <w:szCs w:val="21"/>
         </w:rPr>
-        <w:t xml:space="preserve">Arquivar as mídias no repositório físico da fábrica, identificadas com a versão do software (python-app/app_version.py) e a data de preparação.</w:t>
+        <w:t xml:space="preserve">Arquivar as três mídias (CD(1) DAD, CD(2) DSF e CD(3) DSE) no repositório físico da fábrica, identificadas com a versão do software (python-app/app_version.py) e a data de preparação.</w:t>
       </w:r>
     </w:p>
     <w:p>
@@ -3434,7 +3288,7 @@
           <w:sz w:val="21"/>
           <w:szCs w:val="21"/>
         </w:rPr>
-        <w:t xml:space="preserve">Cada mídia deve conter tudo o que os respectivos passos da instalação (seção 4) exigem, sem depender de nenhum download adicional no computador de destino — essa é a exigência que torna a instalação em campo/fábrica sempre offline.</w:t>
+        <w:t xml:space="preserve">As mídias efetivamente usadas na instalação (CD(2) DSF e CD(3) DSE) devem conter tudo o que os respectivos passos da instalação (seção 4) exigem, sem depender de nenhum download adicional no computador de destino — essa é a exigência que torna a instalação em campo/fábrica sempre offline. O CD(1) DAD fica arquivado só como garantia da fábrica e não participa de nenhum passo da seção 4.</w:t>
       </w:r>
     </w:p>
     <w:sectPr>

</xml_diff>

<commit_message>
Correção: instalação do software Python não usa o CD(1) DAD (#32)
O DAD é só uma exigência de garantia/rastreabilidade da fábrica (mídia
arquivada com o ambiente de desenvolvimento preservado, com o mesmo
conteúdo do CD(2) DSF) — nunca é retirado do repositório físico durante
a instalação, nem mesmo no caminho de desenvolvimento/manutenção.

A instalação do software Python passa a usar só duas mídias: CD(3) DSE
(operador final, seção 4.1/4.2) e CD(2) DSF (desenvolvimento/manutenção,
seção 4.3, agora com o Python portátil e o VSCodium incluídos nela em vez
do CD(1)). O DAD é mencionado só como nota explicativa (equipamentos,
objetivo, ANEXO A) e no diagrama de setup deixa de aparecer como uma
mídia usada no fluxo.

Ajusta também install.bat e build_offline_bundle.bat, que instruíam o
operador/desenvolvedor a buscar arquivos no CD(1) DAD durante a
instalação.

Co-authored-by: Claude <noreply@anthropic.com>
</commit_message>
<xml_diff>
--- a/docs/procedimento-instalacao-software-python.docx
+++ b/docs/procedimento-instalacao-software-python.docx
@@ -412,7 +412,7 @@
                 <w:sz w:val="21"/>
                 <w:szCs w:val="21"/>
               </w:rPr>
-              <w:t xml:space="preserve">Instalar para desenvolvimento/manutenção do software: use o CD(1) DAD + CD(2) DSF, seções 4.2/4.3.</w:t>
+              <w:t xml:space="preserve">Instalar para desenvolvimento/manutenção do software: use o CD(2) DSF, seção 4.3.</w:t>
             </w:r>
           </w:p>
           <w:p>
@@ -473,7 +473,7 @@
           <w:sz w:val="21"/>
           <w:szCs w:val="21"/>
         </w:rPr>
-        <w:t xml:space="preserve">IMPORTANTE: em nenhum momento da instalação — em qualquer um dos caminhos desta seção — é permitido ou necessário usar internet no computador de destino. As três mídias (CD(1) DAD, CD(2) DSF, CD(3) DSE) já contêm tudo o que a instalação exige, sem depender de baixar mais nada nem de outra pessoa preparar algo na hora. A preparação dessas mídias (que exige internet) é atividade separada, de quem mantém o software, feita antes e em outro computador — ver o ANEXO A no fim deste documento, que não faz parte da sequência de instalação.</w:t>
+        <w:t xml:space="preserve">IMPORTANTE: em nenhum momento da instalação — em qualquer um dos caminhos desta seção — é permitido ou necessário usar internet no computador de destino. As mídias usadas na instalação (CD(2) DSF e CD(3) DSE) já contêm tudo o que a instalação exige, sem depender de baixar mais nada nem de outra pessoa preparar algo na hora. A preparação dessas mídias (que exige internet) é atividade separada, de quem mantém o software, feita antes e em outro computador — ver o ANEXO A no fim deste documento, que não faz parte da sequência de instalação. O CD(1) DAD não entra nesta instalação: é uma mídia arquivada só como garantia/regra da fábrica (registro de que o ambiente de desenvolvimento existe e está preservado), sem uso em nenhum passo abaixo.</w:t>
       </w:r>
     </w:p>
     <w:p>
@@ -1068,153 +1068,7 @@
                 <w:sz w:val="21"/>
                 <w:szCs w:val="21"/>
               </w:rPr>
-              <w:t xml:space="preserve">CD(1) DAD — Ambiente de Desenvolvimento: Python 3.10 portátil (sem instalador), instalador do VS Code e o pacote offline_packages, todos já incluídos na mídia; só para instalação a partir do código-fonte, em máquina de desenvolvimento/manutenção (seção 4.3)</w:t>
-            </w:r>
-          </w:p>
-        </w:tc>
-        <w:tc>
-          <w:tcPr>
-            <w:tcW w:type="dxa" w:w="1200"/>
-            <w:tcBorders>
-              <w:top w:val="single" w:color="000000" w:sz="4"/>
-              <w:left w:val="single" w:color="000000" w:sz="4"/>
-              <w:bottom w:val="single" w:color="000000" w:sz="4"/>
-              <w:right w:val="single" w:color="000000" w:sz="4"/>
-            </w:tcBorders>
-            <w:tcMar>
-              <w:top w:type="dxa" w:w="60"/>
-              <w:left w:type="dxa" w:w="100"/>
-              <w:bottom w:type="dxa" w:w="60"/>
-              <w:right w:type="dxa" w:w="100"/>
-            </w:tcMar>
-            <w:vAlign w:val="center"/>
-          </w:tcPr>
-          <w:p>
-            <w:pPr>
-              <w:spacing w:line="240" w:lineRule="auto"/>
-              <w:jc w:val="left"/>
-            </w:pPr>
-            <w:r>
-              <w:rPr>
-                <w:rFonts w:ascii="Arial" w:cs="Arial" w:eastAsia="Arial" w:hAnsi="Arial"/>
-                <w:b w:val="false"/>
-                <w:bCs w:val="false"/>
-                <w:i w:val="false"/>
-                <w:iCs w:val="false"/>
-                <w:sz w:val="21"/>
-                <w:szCs w:val="21"/>
-              </w:rPr>
-              <w:t xml:space="preserve">1</w:t>
-            </w:r>
-          </w:p>
-        </w:tc>
-        <w:tc>
-          <w:tcPr>
-            <w:tcW w:type="dxa" w:w="2000"/>
-            <w:tcBorders>
-              <w:top w:val="single" w:color="000000" w:sz="4"/>
-              <w:left w:val="single" w:color="000000" w:sz="4"/>
-              <w:bottom w:val="single" w:color="000000" w:sz="4"/>
-              <w:right w:val="single" w:color="000000" w:sz="4"/>
-            </w:tcBorders>
-            <w:tcMar>
-              <w:top w:type="dxa" w:w="60"/>
-              <w:left w:type="dxa" w:w="100"/>
-              <w:bottom w:type="dxa" w:w="60"/>
-              <w:right w:type="dxa" w:w="100"/>
-            </w:tcMar>
-            <w:vAlign w:val="center"/>
-          </w:tcPr>
-          <w:p>
-            <w:pPr>
-              <w:spacing w:line="240" w:lineRule="auto"/>
-              <w:jc w:val="left"/>
-            </w:pPr>
-            <w:r>
-              <w:rPr>
-                <w:rFonts w:ascii="Arial" w:cs="Arial" w:eastAsia="Arial" w:hAnsi="Arial"/>
-                <w:b w:val="false"/>
-                <w:bCs w:val="false"/>
-                <w:i w:val="false"/>
-                <w:iCs w:val="false"/>
-                <w:sz w:val="21"/>
-                <w:szCs w:val="21"/>
-              </w:rPr>
-              <w:t xml:space="preserve">DAD</w:t>
-            </w:r>
-          </w:p>
-        </w:tc>
-      </w:tr>
-      <w:tr>
-        <w:tc>
-          <w:tcPr>
-            <w:tcW w:type="dxa" w:w="700"/>
-            <w:tcBorders>
-              <w:top w:val="single" w:color="000000" w:sz="4"/>
-              <w:left w:val="single" w:color="000000" w:sz="4"/>
-              <w:bottom w:val="single" w:color="000000" w:sz="4"/>
-              <w:right w:val="single" w:color="000000" w:sz="4"/>
-            </w:tcBorders>
-            <w:tcMar>
-              <w:top w:type="dxa" w:w="60"/>
-              <w:left w:type="dxa" w:w="100"/>
-              <w:bottom w:type="dxa" w:w="60"/>
-              <w:right w:type="dxa" w:w="100"/>
-            </w:tcMar>
-            <w:vAlign w:val="center"/>
-          </w:tcPr>
-          <w:p>
-            <w:pPr>
-              <w:spacing w:line="240" w:lineRule="auto"/>
-              <w:jc w:val="left"/>
-            </w:pPr>
-            <w:r>
-              <w:rPr>
-                <w:rFonts w:ascii="Arial" w:cs="Arial" w:eastAsia="Arial" w:hAnsi="Arial"/>
-                <w:b w:val="false"/>
-                <w:bCs w:val="false"/>
-                <w:i w:val="false"/>
-                <w:iCs w:val="false"/>
-                <w:sz w:val="21"/>
-                <w:szCs w:val="21"/>
-              </w:rPr>
-              <w:t xml:space="preserve">4</w:t>
-            </w:r>
-          </w:p>
-        </w:tc>
-        <w:tc>
-          <w:tcPr>
-            <w:tcW w:type="dxa" w:w="5738"/>
-            <w:tcBorders>
-              <w:top w:val="single" w:color="000000" w:sz="4"/>
-              <w:left w:val="single" w:color="000000" w:sz="4"/>
-              <w:bottom w:val="single" w:color="000000" w:sz="4"/>
-              <w:right w:val="single" w:color="000000" w:sz="4"/>
-            </w:tcBorders>
-            <w:tcMar>
-              <w:top w:type="dxa" w:w="60"/>
-              <w:left w:type="dxa" w:w="100"/>
-              <w:bottom w:type="dxa" w:w="60"/>
-              <w:right w:type="dxa" w:w="100"/>
-            </w:tcMar>
-            <w:vAlign w:val="center"/>
-          </w:tcPr>
-          <w:p>
-            <w:pPr>
-              <w:spacing w:line="240" w:lineRule="auto"/>
-              <w:jc w:val="left"/>
-            </w:pPr>
-            <w:r>
-              <w:rPr>
-                <w:rFonts w:ascii="Arial" w:cs="Arial" w:eastAsia="Arial" w:hAnsi="Arial"/>
-                <w:b w:val="false"/>
-                <w:bCs w:val="false"/>
-                <w:i w:val="false"/>
-                <w:iCs w:val="false"/>
-                <w:sz w:val="21"/>
-                <w:szCs w:val="21"/>
-              </w:rPr>
-              <w:t xml:space="preserve">CD(2) DSF — Código Fonte: pasta python-app completa; só para instalação a partir do código-fonte, em máquina de desenvolvimento/manutenção (seção 4.3)</w:t>
+              <w:t xml:space="preserve">CD(2) DSF — Código Fonte: pasta python-app completa, incluindo Python 3.10 portátil (sem instalador), instalador do VSCodium e o pacote offline_packages, todos já incluídos na mídia; só para instalação a partir do código-fonte, em máquina de desenvolvimento/manutenção (seção 4.3)</w:t>
             </w:r>
           </w:p>
         </w:tc>
@@ -1303,7 +1157,7 @@
           <w:sz w:val="21"/>
           <w:szCs w:val="21"/>
         </w:rPr>
-        <w:t xml:space="preserve">Para instalar no computador de um operador final, basta o CD(3) DSE (item 2) — não é necessário separar CD(1) e CD(2) nesse caso. O par CD(1)+CD(2) só é retirado do repositório físico da fábrica quando a instalação for para fins de desenvolvimento ou manutenção do próprio software (seção 4.3).</w:t>
+        <w:t xml:space="preserve">Para instalar no computador de um operador final, basta o CD(3) DSE (item 2). O CD(2) DSF só é retirado do repositório físico da fábrica quando a instalação for para fins de desenvolvimento ou manutenção do próprio software (seção 4.3). O CD(1) DAD não é usado em nenhum dos dois casos — fica arquivado no repositório físico da fábrica apenas como garantia/regra da fábrica, sem participar da instalação.</w:t>
       </w:r>
     </w:p>
     <w:p>
@@ -1381,7 +1235,7 @@
           <w:sz w:val="18"/>
           <w:szCs w:val="18"/>
         </w:rPr>
-        <w:t xml:space="preserve">Figura 1 — Diagrama em blocos do setup de instalação: os dois caminhos (operador final via CD(3) DSE; desenvolvimento/manutenção via CD(1) DAD + CD(2) DSF) e o resultado em cada um. Fonte editável (SVG): docs/diagramas/diagrama-setup-instalacao.svg.</w:t>
+        <w:t xml:space="preserve">Figura 1 — Diagrama em blocos do setup de instalação: os dois caminhos (operador final via CD(3) DSE; desenvolvimento/manutenção via CD(2) DSF) e o resultado em cada um. O CD(1) DAD fica arquivado como garantia da fábrica e não participa da instalação. Fonte editável (SVG): docs/diagramas/diagrama-setup-instalacao.svg.</w:t>
       </w:r>
     </w:p>
     <w:p>
@@ -1426,7 +1280,7 @@
           <w:sz w:val="21"/>
           <w:szCs w:val="21"/>
         </w:rPr>
-        <w:t xml:space="preserve">c) se for instalação para desenvolvimento/manutenção do software: retirar o CD(1) DAD e o CD(2) DSF, e seguir a seção 4.3;</w:t>
+        <w:t xml:space="preserve">c) se for instalação para desenvolvimento/manutenção do software: retirar o CD(2) DSF, e seguir a seção 4.3;</w:t>
       </w:r>
     </w:p>
     <w:p>
@@ -1488,7 +1342,7 @@
           <w:sz w:val="21"/>
           <w:szCs w:val="21"/>
         </w:rPr>
-        <w:t xml:space="preserve">Este é o caminho a usar sempre que quem vai operar o software não for programador. O instalador cria um ícone na Área de Trabalho e uma entrada no Menu Iniciar, com a logo da Avibras Aeroco, e o software abre com duplo clique como qualquer outro programa do Windows — sem terminal, sem script .bat, sem editor de código, e sem internet em nenhum momento. Aplicável quando o CD(3) DSE traz o instalador já gerado (Inclinometro-2Eixos-Setup-2.0.0.exe). Não exige Python, CD(1) DAD, CD(2) DSF nem Inno Setup no computador de destino.</w:t>
+        <w:t xml:space="preserve">Este é o caminho a usar sempre que quem vai operar o software não for programador. O instalador cria um ícone na Área de Trabalho e uma entrada no Menu Iniciar, com a logo da Avibras Aeroco, e o software abre com duplo clique como qualquer outro programa do Windows — sem terminal, sem script .bat, sem editor de código, e sem internet em nenhum momento. Aplicável quando o CD(3) DSE traz o instalador já gerado (Inclinometro-2Eixos-Setup-2.0.0.exe). Não exige Python, CD(2) DSF nem Inno Setup no computador de destino.</w:t>
       </w:r>
     </w:p>
     <w:p>
@@ -1594,7 +1448,7 @@
           <w:sz w:val="21"/>
           <w:szCs w:val="21"/>
         </w:rPr>
-        <w:t xml:space="preserve">Aplicável quando o CD(3) DSE traz a pasta já gerada (dist\Inclinometro2Eixos\), preparada previamente por quem mantém o software (ANEXO A). Não exige Python, CD(1) DAD, CD(2) DSF nem internet no computador de destino — mas também não cria ícone na Área de Trabalho nem no Menu Iniciar, e mistura o .exe com vários outros arquivos (bibliotecas) na mesma pasta. Usar apenas para testes rápidos por quem já sabe o que está fazendo; para instalar no computador de um operador final, usar a seção 4.1.</w:t>
+        <w:t xml:space="preserve">Aplicável quando o CD(3) DSE traz a pasta já gerada (dist\Inclinometro2Eixos\), preparada previamente por quem mantém o software (ANEXO A). Não exige Python, CD(2) DSF nem internet no computador de destino — mas também não cria ícone na Área de Trabalho nem no Menu Iniciar, e mistura o .exe com vários outros arquivos (bibliotecas) na mesma pasta. Usar apenas para testes rápidos por quem já sabe o que está fazendo; para instalar no computador de um operador final, usar a seção 4.1.</w:t>
       </w:r>
     </w:p>
     <w:p>
@@ -1661,7 +1515,7 @@
           <w:sz w:val="21"/>
           <w:szCs w:val="21"/>
         </w:rPr>
-        <w:t xml:space="preserve">4.3 Instalação a partir do CD(1) DAD + CD(2) DSF (código-fonte — só para desenvolvimento/manutenção, NÃO para o operador final)</w:t>
+        <w:t xml:space="preserve">4.3 Instalação a partir do CD(2) DSF (código-fonte — só para desenvolvimento/manutenção, NÃO para o operador final)</w:t>
       </w:r>
     </w:p>
     <w:p>
@@ -1700,7 +1554,7 @@
           <w:sz w:val="21"/>
           <w:szCs w:val="21"/>
         </w:rPr>
-        <w:t xml:space="preserve">Copiar a pasta python-app do CD(2) DSF para o computador Windows de destino.</w:t>
+        <w:t xml:space="preserve">Copiar a pasta python-app inteira do CD(2) DSF para o computador Windows de destino — essa pasta já inclui o código-fonte, o Python portátil e o pacote offline_packages.</w:t>
       </w:r>
     </w:p>
     <w:p>
@@ -1725,7 +1579,7 @@
           <w:sz w:val="21"/>
           <w:szCs w:val="21"/>
         </w:rPr>
-        <w:t xml:space="preserve">Copiar a pasta "python" de dentro de python-3.10.21-portable-win64\ (no CD(1) DAD) para python-app\windows\python-portable — ou seja, o caminho final deve ser python-app\windows\python-portable\python.exe. É uma distribuição Python pronta para uso, sem instalador: não precisa executar nada, só copiar a pasta.</w:t>
+        <w:t xml:space="preserve">Copiar a pasta "python" de dentro de python-3.10.21-portable-win64\ (no CD(2) DSF) para python-app\windows\python-portable — ou seja, o caminho final deve ser python-app\windows\python-portable\python.exe. É uma distribuição Python pronta para uso, sem instalador: não precisa executar nada, só copiar a pasta.</w:t>
       </w:r>
     </w:p>
     <w:p>
@@ -1750,7 +1604,7 @@
           <w:sz w:val="21"/>
           <w:szCs w:val="21"/>
         </w:rPr>
-        <w:t xml:space="preserve">Copiar a pasta offline_packages do CD(1) DAD para dentro de python-app\windows\offline_packages.</w:t>
+        <w:t xml:space="preserve">Copiar a pasta offline_packages do CD(2) DSF para dentro de python-app\windows\offline_packages.</w:t>
       </w:r>
     </w:p>
     <w:p>
@@ -1775,7 +1629,7 @@
           <w:sz w:val="21"/>
           <w:szCs w:val="21"/>
         </w:rPr>
-        <w:t xml:space="preserve">Se for editar o código (não apenas rodá-lo), executar o instalador do VS Code (VSCodiumUserSetup-x64-*.exe) do CD(1) DAD — não precisa de direitos de administrador — e abrir a pasta python-app por ele.</w:t>
+        <w:t xml:space="preserve">Se for editar o código (não apenas rodá-lo), executar o instalador do VS Code (VSCodiumUserSetup-x64-*.exe) do CD(2) DSF — não precisa de direitos de administrador — e abrir a pasta python-app por ele.</w:t>
       </w:r>
     </w:p>
     <w:p>
@@ -2905,7 +2759,7 @@
                 <w:sz w:val="21"/>
                 <w:szCs w:val="21"/>
               </w:rPr>
-              <w:t xml:space="preserve">Copiar a pasta "python" do CD(1) DAD para python-app\windows\python-portable, conforme a seção 4.3</w:t>
+              <w:t xml:space="preserve">Copiar a pasta "python" do CD(2) DSF para python-app\windows\python-portable, conforme a seção 4.3</w:t>
             </w:r>
           </w:p>
         </w:tc>
@@ -2979,7 +2833,7 @@
                 <w:sz w:val="21"/>
                 <w:szCs w:val="21"/>
               </w:rPr>
-              <w:t xml:space="preserve">CD(1) DAD com windows\offline_packages incompleto ou desatualizado em relação a requirements.txt</w:t>
+              <w:t xml:space="preserve">CD(2) DSF com windows\offline_packages incompleto ou desatualizado em relação a requirements.txt</w:t>
             </w:r>
           </w:p>
         </w:tc>
@@ -3015,7 +2869,7 @@
                 <w:sz w:val="21"/>
                 <w:szCs w:val="21"/>
               </w:rPr>
-              <w:t xml:space="preserve">Solicitar CD(1) DAD atualizado, gerado conforme o ANEXO A; nunca tentar instalar pela internet no computador de campo/fábrica</w:t>
+              <w:t xml:space="preserve">Solicitar CD(2) DSF atualizado, gerado conforme o ANEXO A; nunca tentar instalar pela internet no computador de campo/fábrica</w:t>
             </w:r>
           </w:p>
         </w:tc>
@@ -3254,7 +3108,7 @@
           <w:sz w:val="22"/>
           <w:szCs w:val="22"/>
         </w:rPr>
-        <w:t xml:space="preserve">ANEXO A — PREPARAÇÃO DAS MÍDIAS CD(1) DAD, CD(2) DSF E CD(3) DSE</w:t>
+        <w:t xml:space="preserve">ANEXO A — PREPARAÇÃO DAS MÍDIAS CD(2) DSF, CD(3) DSE E ARQUIVAMENTO DO CD(1) DAD</w:t>
       </w:r>
     </w:p>
     <w:tbl>
@@ -3345,7 +3199,7 @@
           <w:sz w:val="21"/>
           <w:szCs w:val="21"/>
         </w:rPr>
-        <w:t xml:space="preserve">CD(1) DAD: numa máquina com internet, dar duplo clique em windows\build_offline_bundle.bat. Baixa todos os pacotes de requirements.txt (PyQt5, pymodbus, pyserial, bleak — incluindo o backend Bluetooth do Windows — reportlab, matplotlib, numpy) para windows\offline_packages. Gravar essa pasta no CD(1) DAD, junto com uma distribuição Python 3.10 portátil para Windows (ex.: python-build-standalone, install_only, x86_64-pc-windows-msvc — ou o instalador oficial em python.org/downloads/windows, se preferir) e o instalador do VS Code ("User Installer" x64, code.visualstudio.com/download — ou o instalador do VSCodium, equivalente sem telemetria, em github.com/VSCodium/vscodium/releases).</w:t>
+        <w:t xml:space="preserve">CD(2) DSF: numa máquina com internet, dar duplo clique em windows\build_offline_bundle.bat. Baixa todos os pacotes de requirements.txt (PyQt5, pymodbus, pyserial, bleak — incluindo o backend Bluetooth do Windows — reportlab, matplotlib, numpy) para windows\offline_packages. Gravar a pasta python-app inteira (código-fonte + windows\offline_packages), junto com uma distribuição Python 3.10 portátil para Windows (ex.: python-build-standalone, install_only, x86_64-pc-windows-msvc — ou o instalador oficial em python.org/downloads/windows, se preferir) e o instalador do VS Code ("User Installer" x64, code.visualstudio.com/download — ou o instalador do VSCodium, equivalente sem telemetria, em github.com/VSCodium/vscodium/releases), no CD(2) DSF.</w:t>
       </w:r>
     </w:p>
     <w:p>
@@ -3370,7 +3224,7 @@
           <w:sz w:val="21"/>
           <w:szCs w:val="21"/>
         </w:rPr>
-        <w:t xml:space="preserve">CD(2) DSF: gravar a pasta python-app inteira (código-fonte, sem windows\offline_packages e sem windows\python-portable — esses ficam só no CD(1)) no CD(2) DSF.</w:t>
+        <w:t xml:space="preserve">CD(1) DAD (exigência de garantia/rastreabilidade da fábrica, sem uso na instalação): gravar mais uma cópia idêntica de todo o conteúdo do CD(2) DSF (passo 1), identificada como CD(1) DAD, e arquivar junto às demais mídias. A regra da fábrica exige manter um ambiente de desenvolvimento completo registrado em mídia — mas esse CD nunca é retirado do repositório físico durante a instalação (seção 4), só em auditoria.</w:t>
       </w:r>
     </w:p>
     <w:p>
@@ -3395,7 +3249,7 @@
           <w:sz w:val="21"/>
           <w:szCs w:val="21"/>
         </w:rPr>
-        <w:t xml:space="preserve">CD(3) DSE (opcional, alternativa ao par CD(1)+CD(2) para quem só quer instalar, não desenvolver): usando o CD(1) e o CD(2) já preparados numa máquina Windows, rodar windows\build_exe.bat (gera dist\Inclinometro2Eixos\) ou windows\build_installer.bat (gera o instalador Setup.exe, exige Inno Setup só nesta máquina de geração) e gravar o resultado no CD(3) DSE.</w:t>
+        <w:t xml:space="preserve">CD(3) DSE (opcional, alternativa ao CD(2) DSF para quem só quer instalar, não desenvolver): usando o CD(2) DSF já preparado numa máquina Windows, rodar windows\build_exe.bat (gera dist\Inclinometro2Eixos\) ou windows\build_installer.bat (gera o instalador Setup.exe, exige Inno Setup só nesta máquina de geração) e gravar o resultado no CD(3) DSE.</w:t>
       </w:r>
     </w:p>
     <w:p>
@@ -3420,7 +3274,7 @@
           <w:sz w:val="21"/>
           <w:szCs w:val="21"/>
         </w:rPr>
-        <w:t xml:space="preserve">Arquivar as mídias no repositório físico da fábrica, identificadas com a versão do software (python-app/app_version.py) e a data de preparação.</w:t>
+        <w:t xml:space="preserve">Arquivar as três mídias (CD(1) DAD, CD(2) DSF e CD(3) DSE) no repositório físico da fábrica, identificadas com a versão do software (python-app/app_version.py) e a data de preparação.</w:t>
       </w:r>
     </w:p>
     <w:p>
@@ -3434,7 +3288,7 @@
           <w:sz w:val="21"/>
           <w:szCs w:val="21"/>
         </w:rPr>
-        <w:t xml:space="preserve">Cada mídia deve conter tudo o que os respectivos passos da instalação (seção 4) exigem, sem depender de nenhum download adicional no computador de destino — essa é a exigência que torna a instalação em campo/fábrica sempre offline.</w:t>
+        <w:t xml:space="preserve">As mídias efetivamente usadas na instalação (CD(2) DSF e CD(3) DSE) devem conter tudo o que os respectivos passos da instalação (seção 4) exigem, sem depender de nenhum download adicional no computador de destino — essa é a exigência que torna a instalação em campo/fábrica sempre offline. O CD(1) DAD fica arquivado só como garantia da fábrica e não participa de nenhum passo da seção 4.</w:t>
       </w:r>
     </w:p>
     <w:sectPr>

</xml_diff>

<commit_message>
CD(1) DAD passa a conter só o IDE/ferramentas de criação do software
Ajusta a definição do CD(1) DAD conforme a regra real da fábrica: DAD é
somente os softwares usados como IDE e necessários para a criação do
software (ex.: VSCodium/VS Code) — não é uma cópia do código-fonte nem
do conteúdo do CD(2) DSF.

No procedimento de instalação do software Python:
- o CD(2) DSF passa a levar só o Python portátil (runtime, necessário
  para rodar o software a partir do código-fonte) e o offline_packages,
  sem o instalador de IDE;
- o passo de instalar o VSCodium/VS Code (só necessário para quem vai
  editar o código, fora do escopo de uma instalação) sai da seção 4.3 e
  passa a ser citado como conteúdo do CD(1) DAD no ANEXO A;
- o ANEXO A e o docs/README.md são atualizados para refletir que o
  CD(1) DAD nunca é retirado do repositório físico durante a instalação,
  nem mesmo no caminho de desenvolvimento/manutenção — rodar o software
  a partir do código-fonte não exige um IDE.
</commit_message>
<xml_diff>
--- a/docs/procedimento-instalacao-software-python.docx
+++ b/docs/procedimento-instalacao-software-python.docx
@@ -1068,7 +1068,7 @@
                 <w:sz w:val="21"/>
                 <w:szCs w:val="21"/>
               </w:rPr>
-              <w:t xml:space="preserve">CD(2) DSF — Código Fonte: pasta python-app completa, incluindo Python 3.10 portátil (sem instalador), instalador do VSCodium e o pacote offline_packages, todos já incluídos na mídia; só para instalação a partir do código-fonte, em máquina de desenvolvimento/manutenção (seção 4.3)</w:t>
+              <w:t xml:space="preserve">CD(2) DSF — Código Fonte: pasta python-app completa, incluindo Python 3.10 portátil (sem instalador) e o pacote offline_packages, já incluídos na mídia; só para instalação/execução a partir do código-fonte, em máquina de desenvolvimento/manutenção (seção 4.3)</w:t>
             </w:r>
           </w:p>
         </w:tc>
@@ -1629,7 +1629,7 @@
           <w:sz w:val="21"/>
           <w:szCs w:val="21"/>
         </w:rPr>
-        <w:t xml:space="preserve">Se for editar o código (não apenas rodá-lo), executar o instalador do VS Code (VSCodiumUserSetup-x64-*.exe) do CD(2) DSF — não precisa de direitos de administrador — e abrir a pasta python-app por ele.</w:t>
+        <w:t xml:space="preserve">Dar duplo clique em windows\install.bat. O script detecta automaticamente o Python portátil (passo 2) e a pasta offline_packages (passo 3), e instala tudo sem tentar acessar a internet.</w:t>
       </w:r>
     </w:p>
     <w:p>
@@ -1654,32 +1654,21 @@
           <w:sz w:val="21"/>
           <w:szCs w:val="21"/>
         </w:rPr>
-        <w:t xml:space="preserve">Dar duplo clique em windows\install.bat. O script detecta automaticamente o Python portátil (passo 2) e a pasta offline_packages (passo 3), e instala tudo sem tentar acessar a internet.</w:t>
-      </w:r>
-    </w:p>
-    <w:p>
-      <w:pPr>
-        <w:spacing w:after="100" w:line="264" w:lineRule="auto"/>
-        <w:ind w:left="500" w:hanging="300"/>
+        <w:t xml:space="preserve">Para abrir o software (nesta e nas próximas vezes), dar duplo clique em windows\run.bat.</w:t>
+      </w:r>
+    </w:p>
+    <w:p>
+      <w:pPr>
+        <w:spacing w:after="160" w:before="0" w:line="264" w:lineRule="auto"/>
         <w:jc w:val="both"/>
       </w:pPr>
       <w:r>
         <w:rPr>
           <w:rFonts w:ascii="Arial" w:cs="Arial" w:eastAsia="Arial" w:hAnsi="Arial"/>
-          <w:b/>
-          <w:bCs/>
-          <w:sz w:val="21"/>
-          <w:szCs w:val="21"/>
-        </w:rPr>
-        <w:t xml:space="preserve">6. </w:t>
-      </w:r>
-      <w:r>
-        <w:rPr>
-          <w:rFonts w:ascii="Arial" w:cs="Arial" w:eastAsia="Arial" w:hAnsi="Arial"/>
-          <w:sz w:val="21"/>
-          <w:szCs w:val="21"/>
-        </w:rPr>
-        <w:t xml:space="preserve">Para abrir o software (nesta e nas próximas vezes), dar duplo clique em windows\run.bat.</w:t>
+          <w:sz w:val="21"/>
+          <w:szCs w:val="21"/>
+        </w:rPr>
+        <w:t xml:space="preserve">Estes passos instalam e executam o software a partir do código-fonte — não incluem um editor/IDE, porque editar o código está fora do escopo deste procedimento de instalação. Quem for de fato desenvolver/alterar o código usa suas próprias ferramentas de desenvolvimento (ex.: VSCodium ou VS Code), fora desta sequência; o CD(1) DAD arquiva essas ferramentas apenas como garantia/regra da fábrica (ver ANEXO A).</w:t>
       </w:r>
     </w:p>
     <w:p>
@@ -3199,7 +3188,7 @@
           <w:sz w:val="21"/>
           <w:szCs w:val="21"/>
         </w:rPr>
-        <w:t xml:space="preserve">CD(2) DSF: numa máquina com internet, dar duplo clique em windows\build_offline_bundle.bat. Baixa todos os pacotes de requirements.txt (PyQt5, pymodbus, pyserial, bleak — incluindo o backend Bluetooth do Windows — reportlab, matplotlib, numpy) para windows\offline_packages. Gravar a pasta python-app inteira (código-fonte + windows\offline_packages), junto com uma distribuição Python 3.10 portátil para Windows (ex.: python-build-standalone, install_only, x86_64-pc-windows-msvc — ou o instalador oficial em python.org/downloads/windows, se preferir) e o instalador do VS Code ("User Installer" x64, code.visualstudio.com/download — ou o instalador do VSCodium, equivalente sem telemetria, em github.com/VSCodium/vscodium/releases), no CD(2) DSF.</w:t>
+        <w:t xml:space="preserve">CD(2) DSF: numa máquina com internet, dar duplo clique em windows\build_offline_bundle.bat. Baixa todos os pacotes de requirements.txt (PyQt5, pymodbus, pyserial, bleak — incluindo o backend Bluetooth do Windows — reportlab, matplotlib, numpy) para windows\offline_packages. Gravar a pasta python-app inteira (código-fonte + windows\offline_packages), junto com uma distribuição Python 3.10 portátil para Windows (ex.: python-build-standalone, install_only, x86_64-pc-windows-msvc — ou o instalador oficial em python.org/downloads/windows, se preferir), no CD(2) DSF.</w:t>
       </w:r>
     </w:p>
     <w:p>
@@ -3224,7 +3213,7 @@
           <w:sz w:val="21"/>
           <w:szCs w:val="21"/>
         </w:rPr>
-        <w:t xml:space="preserve">CD(1) DAD (exigência de garantia/rastreabilidade da fábrica, sem uso na instalação): gravar mais uma cópia idêntica de todo o conteúdo do CD(2) DSF (passo 1), identificada como CD(1) DAD, e arquivar junto às demais mídias. A regra da fábrica exige manter um ambiente de desenvolvimento completo registrado em mídia — mas esse CD nunca é retirado do repositório físico durante a instalação (seção 4), só em auditoria.</w:t>
+        <w:t xml:space="preserve">CD(1) DAD (exigência de garantia/rastreabilidade da fábrica, sem uso na instalação): gravar, nesta mídia, apenas o(s) instalador(es) do IDE e demais ferramentas usadas na criação do software (ex.: VSCodium ou VS Code — "User Installer" x64, code.visualstudio.com/download, ou o instalador do VSCodium em github.com/VSCodium/vscodium/releases). O CD(1) DAD não contém código-fonte nem os arquivos do CD(2) DSF — é só o registro de que o ambiente/ferramentas de desenvolvimento existem e estão preservados. A regra da fábrica exige mantê-lo arquivado, mas ele nunca é retirado do repositório físico durante a instalação (seção 4), só em auditoria.</w:t>
       </w:r>
     </w:p>
     <w:p>

</xml_diff>

<commit_message>
Adiciona Python (instalador completo) ao conteúdo do CD(1) DAD
O CD(1) DAD, além do IDE (VSCodium/VS Code), também precisa arquivar um
instalador completo do Python para Windows — igualmente necessário para
desenvolver/editar o software, além do runtime portátil que já vai só
no CD(2) DSF para rodar o software instalado a partir do código-fonte.

Atualiza o procedimento de instalação do software Python, o
docs/README.md e build_offline_bundle.bat na mesma linha.
</commit_message>
<xml_diff>
--- a/docs/procedimento-instalacao-software-python.docx
+++ b/docs/procedimento-instalacao-software-python.docx
@@ -1668,7 +1668,7 @@
           <w:sz w:val="21"/>
           <w:szCs w:val="21"/>
         </w:rPr>
-        <w:t xml:space="preserve">Estes passos instalam e executam o software a partir do código-fonte — não incluem um editor/IDE, porque editar o código está fora do escopo deste procedimento de instalação. Quem for de fato desenvolver/alterar o código usa suas próprias ferramentas de desenvolvimento (ex.: VSCodium ou VS Code), fora desta sequência; o CD(1) DAD arquiva essas ferramentas apenas como garantia/regra da fábrica (ver ANEXO A).</w:t>
+        <w:t xml:space="preserve">Estes passos instalam e executam o software a partir do código-fonte, usando o Python portátil só como runtime — não incluem um editor/IDE nem uma instalação completa de Python para desenvolvimento, porque editar o código está fora do escopo deste procedimento de instalação. Quem for de fato desenvolver/alterar o código usa suas próprias ferramentas de desenvolvimento (IDE e Python instalados normalmente, ex.: VSCodium ou VS Code), fora desta sequência; o CD(1) DAD arquiva essas ferramentas apenas como garantia/regra da fábrica (ver ANEXO A).</w:t>
       </w:r>
     </w:p>
     <w:p>
@@ -3213,7 +3213,7 @@
           <w:sz w:val="21"/>
           <w:szCs w:val="21"/>
         </w:rPr>
-        <w:t xml:space="preserve">CD(1) DAD (exigência de garantia/rastreabilidade da fábrica, sem uso na instalação): gravar, nesta mídia, apenas o(s) instalador(es) do IDE e demais ferramentas usadas na criação do software (ex.: VSCodium ou VS Code — "User Installer" x64, code.visualstudio.com/download, ou o instalador do VSCodium em github.com/VSCodium/vscodium/releases). O CD(1) DAD não contém código-fonte nem os arquivos do CD(2) DSF — é só o registro de que o ambiente/ferramentas de desenvolvimento existem e estão preservados. A regra da fábrica exige mantê-lo arquivado, mas ele nunca é retirado do repositório físico durante a instalação (seção 4), só em auditoria.</w:t>
+        <w:t xml:space="preserve">CD(1) DAD (exigência de garantia/rastreabilidade da fábrica, sem uso na instalação): gravar, nesta mídia, o(s) instalador(es) do IDE e demais ferramentas usadas na criação do software — o instalador do VSCodium ou VS Code ("User Installer" x64, code.visualstudio.com/download, ou github.com/VSCodium/vscodium/releases) e também um instalador completo do Python 3.10+ para Windows (python.org/downloads/windows), igualmente necessário para desenvolver/testar o software, além do runtime portátil que já vai no CD(2) DSF. O CD(1) DAD não contém código-fonte nem os arquivos do CD(2) DSF — é só o registro de que o ambiente/ferramentas de desenvolvimento existem e estão preservados. A regra da fábrica exige mantê-lo arquivado, mas ele nunca é retirado do repositório físico durante a instalação (seção 4), só em auditoria.</w:t>
       </w:r>
     </w:p>
     <w:p>

</xml_diff>

<commit_message>
Adiciona Python ao conteúdo do CD(1) DAD (#34)
O CD(1) DAD, além do IDE (VSCodium/VS Code), também precisa arquivar um
instalador completo do Python para Windows — igualmente necessário para
desenvolver/editar o software, além do runtime portátil que já vai só
no CD(2) DSF para rodar o software instalado a partir do código-fonte.

Atualiza o procedimento de instalação do software Python, o
docs/README.md e build_offline_bundle.bat na mesma linha.

Co-authored-by: Claude <noreply@anthropic.com>
</commit_message>
<xml_diff>
--- a/docs/procedimento-instalacao-software-python.docx
+++ b/docs/procedimento-instalacao-software-python.docx
@@ -1668,7 +1668,7 @@
           <w:sz w:val="21"/>
           <w:szCs w:val="21"/>
         </w:rPr>
-        <w:t xml:space="preserve">Estes passos instalam e executam o software a partir do código-fonte — não incluem um editor/IDE, porque editar o código está fora do escopo deste procedimento de instalação. Quem for de fato desenvolver/alterar o código usa suas próprias ferramentas de desenvolvimento (ex.: VSCodium ou VS Code), fora desta sequência; o CD(1) DAD arquiva essas ferramentas apenas como garantia/regra da fábrica (ver ANEXO A).</w:t>
+        <w:t xml:space="preserve">Estes passos instalam e executam o software a partir do código-fonte, usando o Python portátil só como runtime — não incluem um editor/IDE nem uma instalação completa de Python para desenvolvimento, porque editar o código está fora do escopo deste procedimento de instalação. Quem for de fato desenvolver/alterar o código usa suas próprias ferramentas de desenvolvimento (IDE e Python instalados normalmente, ex.: VSCodium ou VS Code), fora desta sequência; o CD(1) DAD arquiva essas ferramentas apenas como garantia/regra da fábrica (ver ANEXO A).</w:t>
       </w:r>
     </w:p>
     <w:p>
@@ -3213,7 +3213,7 @@
           <w:sz w:val="21"/>
           <w:szCs w:val="21"/>
         </w:rPr>
-        <w:t xml:space="preserve">CD(1) DAD (exigência de garantia/rastreabilidade da fábrica, sem uso na instalação): gravar, nesta mídia, apenas o(s) instalador(es) do IDE e demais ferramentas usadas na criação do software (ex.: VSCodium ou VS Code — "User Installer" x64, code.visualstudio.com/download, ou o instalador do VSCodium em github.com/VSCodium/vscodium/releases). O CD(1) DAD não contém código-fonte nem os arquivos do CD(2) DSF — é só o registro de que o ambiente/ferramentas de desenvolvimento existem e estão preservados. A regra da fábrica exige mantê-lo arquivado, mas ele nunca é retirado do repositório físico durante a instalação (seção 4), só em auditoria.</w:t>
+        <w:t xml:space="preserve">CD(1) DAD (exigência de garantia/rastreabilidade da fábrica, sem uso na instalação): gravar, nesta mídia, o(s) instalador(es) do IDE e demais ferramentas usadas na criação do software — o instalador do VSCodium ou VS Code ("User Installer" x64, code.visualstudio.com/download, ou github.com/VSCodium/vscodium/releases) e também um instalador completo do Python 3.10+ para Windows (python.org/downloads/windows), igualmente necessário para desenvolver/testar o software, além do runtime portátil que já vai no CD(2) DSF. O CD(1) DAD não contém código-fonte nem os arquivos do CD(2) DSF — é só o registro de que o ambiente/ferramentas de desenvolvimento existem e estão preservados. A regra da fábrica exige mantê-lo arquivado, mas ele nunca é retirado do repositório físico durante a instalação (seção 4), só em auditoria.</w:t>
       </w:r>
     </w:p>
     <w:p>

</xml_diff>